<commit_message>
Template for sprint 3 backlog items and updates
</commit_message>
<xml_diff>
--- a/documentation/Backlog.docx
+++ b/documentation/Backlog.docx
@@ -5322,6 +5322,125 @@
         </w:rPr>
       </w:r>
     </w:p>
+    <w:p/>
+    <w:p>
+      <w:pPr>
+        <w:pStyle w:val="Normal"/>
+      </w:pPr>
+      <w:r>
+        <w:t>Backlog Sprint 3:</w:t>
+      </w:r>
+    </w:p>
+    <w:p/>
+    <w:p>
+      <w:pPr>
+        <w:pStyle w:val="Normal"/>
+        <w:numPr>
+          <w:ilvl w:val="0"/>
+          <w:numId w:val="1"/>
+        </w:numPr>
+      </w:pPr>
+      <w:r>
+        <w:t>Added Google Places price integration from frontend to backend.</w:t>
+      </w:r>
+    </w:p>
+    <w:p>
+      <w:pPr>
+        <w:pStyle w:val="Normal"/>
+        <w:numPr>
+          <w:ilvl w:val="0"/>
+          <w:numId w:val="1"/>
+        </w:numPr>
+      </w:pPr>
+      <w:r>
+        <w:t>Implemented cached station and pricing retrieval to reduce stale data.</w:t>
+      </w:r>
+    </w:p>
+    <w:p>
+      <w:pPr>
+        <w:pStyle w:val="Normal"/>
+        <w:numPr>
+          <w:ilvl w:val="0"/>
+          <w:numId w:val="1"/>
+        </w:numPr>
+      </w:pPr>
+      <w:r>
+        <w:t>Added basic pricing display with side-view station details.</w:t>
+      </w:r>
+    </w:p>
+    <w:p>
+      <w:pPr>
+        <w:pStyle w:val="Normal"/>
+        <w:numPr>
+          <w:ilvl w:val="0"/>
+          <w:numId w:val="1"/>
+        </w:numPr>
+      </w:pPr>
+      <w:r>
+        <w:t>Implemented marker click InfoWindow with sorted fuel prices.</w:t>
+      </w:r>
+    </w:p>
+    <w:p>
+      <w:pPr>
+        <w:pStyle w:val="Normal"/>
+        <w:numPr>
+          <w:ilvl w:val="0"/>
+          <w:numId w:val="1"/>
+        </w:numPr>
+      </w:pPr>
+      <w:r>
+        <w:t>Added fuel type and fuel grade filtering for station price sorting.</w:t>
+      </w:r>
+    </w:p>
+    <w:p>
+      <w:pPr>
+        <w:pStyle w:val="Normal"/>
+        <w:numPr>
+          <w:ilvl w:val="0"/>
+          <w:numId w:val="1"/>
+        </w:numPr>
+      </w:pPr>
+      <w:r>
+        <w:t>Fixed fuel price rendering issues and improved frontend visual theme.</w:t>
+      </w:r>
+    </w:p>
+    <w:p>
+      <w:pPr>
+        <w:pStyle w:val="Normal"/>
+        <w:numPr>
+          <w:ilvl w:val="0"/>
+          <w:numId w:val="1"/>
+        </w:numPr>
+      </w:pPr>
+      <w:r>
+        <w:t>Expanded backend automated tests for app and price services; fixed frontend tests.</w:t>
+      </w:r>
+    </w:p>
+    <w:p>
+      <w:pPr>
+        <w:pStyle w:val="Normal"/>
+        <w:numPr>
+          <w:ilvl w:val="0"/>
+          <w:numId w:val="1"/>
+        </w:numPr>
+      </w:pPr>
+      <w:r>
+        <w:t>Updated Docker and port configuration plus API/CORS environment settings.</w:t>
+      </w:r>
+    </w:p>
+    <w:p>
+      <w:pPr>
+        <w:pStyle w:val="Normal"/>
+        <w:numPr>
+          <w:ilvl w:val="0"/>
+          <w:numId w:val="1"/>
+        </w:numPr>
+      </w:pPr>
+      <w:r>
+        <w:t>Completed Sprint 3 documentation updates (baseline, class diagram, and bug report template).</w:t>
+      </w:r>
+    </w:p>
+    <w:p/>
     <w:sectPr>
       <w:type w:val="nextPage"/>
       <w:pgSz w:w="11906" w:h="16838"/>

</xml_diff>

<commit_message>
Backlog updated with more details and baseline added backlog
</commit_message>
<xml_diff>
--- a/documentation/Backlog.docx
+++ b/documentation/Backlog.docx
@@ -5332,114 +5332,540 @@
       </w:r>
     </w:p>
     <w:p/>
-    <w:p>
-      <w:pPr>
-        <w:pStyle w:val="Normal"/>
-        <w:numPr>
-          <w:ilvl w:val="0"/>
-          <w:numId w:val="1"/>
-        </w:numPr>
-      </w:pPr>
-      <w:r>
-        <w:t>Added Google Places price integration from frontend to backend.</w:t>
-      </w:r>
-    </w:p>
-    <w:p>
-      <w:pPr>
-        <w:pStyle w:val="Normal"/>
-        <w:numPr>
-          <w:ilvl w:val="0"/>
-          <w:numId w:val="1"/>
-        </w:numPr>
-      </w:pPr>
-      <w:r>
-        <w:t>Implemented cached station and pricing retrieval to reduce stale data.</w:t>
-      </w:r>
-    </w:p>
-    <w:p>
-      <w:pPr>
-        <w:pStyle w:val="Normal"/>
-        <w:numPr>
-          <w:ilvl w:val="0"/>
-          <w:numId w:val="1"/>
-        </w:numPr>
-      </w:pPr>
-      <w:r>
-        <w:t>Added basic pricing display with side-view station details.</w:t>
-      </w:r>
-    </w:p>
-    <w:p>
-      <w:pPr>
-        <w:pStyle w:val="Normal"/>
-        <w:numPr>
-          <w:ilvl w:val="0"/>
-          <w:numId w:val="1"/>
-        </w:numPr>
-      </w:pPr>
-      <w:r>
-        <w:t>Implemented marker click InfoWindow with sorted fuel prices.</w:t>
-      </w:r>
-    </w:p>
-    <w:p>
-      <w:pPr>
-        <w:pStyle w:val="Normal"/>
-        <w:numPr>
-          <w:ilvl w:val="0"/>
-          <w:numId w:val="1"/>
-        </w:numPr>
-      </w:pPr>
-      <w:r>
-        <w:t>Added fuel type and fuel grade filtering for station price sorting.</w:t>
-      </w:r>
-    </w:p>
-    <w:p>
-      <w:pPr>
-        <w:pStyle w:val="Normal"/>
-        <w:numPr>
-          <w:ilvl w:val="0"/>
-          <w:numId w:val="1"/>
-        </w:numPr>
-      </w:pPr>
-      <w:r>
-        <w:t>Fixed fuel price rendering issues and improved frontend visual theme.</w:t>
-      </w:r>
-    </w:p>
-    <w:p>
-      <w:pPr>
-        <w:pStyle w:val="Normal"/>
-        <w:numPr>
-          <w:ilvl w:val="0"/>
-          <w:numId w:val="1"/>
-        </w:numPr>
-      </w:pPr>
-      <w:r>
-        <w:t>Expanded backend automated tests for app and price services; fixed frontend tests.</w:t>
-      </w:r>
-    </w:p>
-    <w:p>
-      <w:pPr>
-        <w:pStyle w:val="Normal"/>
-        <w:numPr>
-          <w:ilvl w:val="0"/>
-          <w:numId w:val="1"/>
-        </w:numPr>
-      </w:pPr>
-      <w:r>
-        <w:t>Updated Docker and port configuration plus API/CORS environment settings.</w:t>
-      </w:r>
-    </w:p>
-    <w:p>
-      <w:pPr>
-        <w:pStyle w:val="Normal"/>
-        <w:numPr>
-          <w:ilvl w:val="0"/>
-          <w:numId w:val="1"/>
-        </w:numPr>
-      </w:pPr>
-      <w:r>
-        <w:t>Completed Sprint 3 documentation updates (baseline, class diagram, and bug report template).</w:t>
-      </w:r>
-    </w:p>
+    <w:p/>
+    <w:tbl>
+      <w:tblPr>
+        <w:tblW w:type="auto" w:w="0"/>
+        <w:tblLook w:firstColumn="1" w:firstRow="1" w:lastColumn="0" w:lastRow="0" w:noHBand="0" w:noVBand="1" w:val="04A0"/>
+      </w:tblPr>
+      <w:tblGrid>
+        <w:gridCol w:w="1928"/>
+        <w:gridCol w:w="1928"/>
+        <w:gridCol w:w="1928"/>
+        <w:gridCol w:w="1928"/>
+        <w:gridCol w:w="1928"/>
+      </w:tblGrid>
+      <w:tr>
+        <w:tc>
+          <w:tcPr>
+            <w:tcW w:type="dxa" w:w="1928"/>
+          </w:tcPr>
+          <w:p>
+            <w:r>
+              <w:t>ID</w:t>
+            </w:r>
+          </w:p>
+        </w:tc>
+        <w:tc>
+          <w:tcPr>
+            <w:tcW w:type="dxa" w:w="1928"/>
+          </w:tcPr>
+          <w:p>
+            <w:r>
+              <w:t>Task</w:t>
+            </w:r>
+          </w:p>
+        </w:tc>
+        <w:tc>
+          <w:tcPr>
+            <w:tcW w:type="dxa" w:w="1928"/>
+          </w:tcPr>
+          <w:p>
+            <w:r>
+              <w:t>Priority</w:t>
+            </w:r>
+          </w:p>
+        </w:tc>
+        <w:tc>
+          <w:tcPr>
+            <w:tcW w:type="dxa" w:w="1928"/>
+          </w:tcPr>
+          <w:p>
+            <w:r>
+              <w:t>Status</w:t>
+            </w:r>
+          </w:p>
+        </w:tc>
+        <w:tc>
+          <w:tcPr>
+            <w:tcW w:type="dxa" w:w="1928"/>
+          </w:tcPr>
+          <w:p>
+            <w:r>
+              <w:t>Assigned To</w:t>
+            </w:r>
+          </w:p>
+        </w:tc>
+      </w:tr>
+      <w:tr>
+        <w:tc>
+          <w:tcPr>
+            <w:tcW w:type="dxa" w:w="1928"/>
+          </w:tcPr>
+          <w:p>
+            <w:r>
+              <w:t>3a</w:t>
+            </w:r>
+          </w:p>
+        </w:tc>
+        <w:tc>
+          <w:tcPr>
+            <w:tcW w:type="dxa" w:w="1928"/>
+          </w:tcPr>
+          <w:p>
+            <w:r>
+              <w:t>Added Google Places price integration from frontend to backend.</w:t>
+            </w:r>
+          </w:p>
+        </w:tc>
+        <w:tc>
+          <w:tcPr>
+            <w:tcW w:type="dxa" w:w="1928"/>
+          </w:tcPr>
+          <w:p>
+            <w:r>
+              <w:t>High</w:t>
+            </w:r>
+          </w:p>
+        </w:tc>
+        <w:tc>
+          <w:tcPr>
+            <w:tcW w:type="dxa" w:w="1928"/>
+          </w:tcPr>
+          <w:p>
+            <w:r>
+              <w:t>Complete</w:t>
+            </w:r>
+          </w:p>
+        </w:tc>
+        <w:tc>
+          <w:tcPr>
+            <w:tcW w:type="dxa" w:w="1928"/>
+          </w:tcPr>
+          <w:p>
+            <w:r>
+              <w:t>Nate C</w:t>
+            </w:r>
+          </w:p>
+        </w:tc>
+      </w:tr>
+      <w:tr>
+        <w:tc>
+          <w:tcPr>
+            <w:tcW w:type="dxa" w:w="1928"/>
+          </w:tcPr>
+          <w:p>
+            <w:r>
+              <w:t>3b</w:t>
+            </w:r>
+          </w:p>
+        </w:tc>
+        <w:tc>
+          <w:tcPr>
+            <w:tcW w:type="dxa" w:w="1928"/>
+          </w:tcPr>
+          <w:p>
+            <w:r>
+              <w:t>Implemented cached station and pricing retrieval to reduce stale data.</w:t>
+            </w:r>
+          </w:p>
+        </w:tc>
+        <w:tc>
+          <w:tcPr>
+            <w:tcW w:type="dxa" w:w="1928"/>
+          </w:tcPr>
+          <w:p>
+            <w:r>
+              <w:t>High</w:t>
+            </w:r>
+          </w:p>
+        </w:tc>
+        <w:tc>
+          <w:tcPr>
+            <w:tcW w:type="dxa" w:w="1928"/>
+          </w:tcPr>
+          <w:p>
+            <w:r>
+              <w:t>Complete</w:t>
+            </w:r>
+          </w:p>
+        </w:tc>
+        <w:tc>
+          <w:tcPr>
+            <w:tcW w:type="dxa" w:w="1928"/>
+          </w:tcPr>
+          <w:p>
+            <w:r>
+              <w:t>Kyler C</w:t>
+            </w:r>
+          </w:p>
+        </w:tc>
+      </w:tr>
+      <w:tr>
+        <w:tc>
+          <w:tcPr>
+            <w:tcW w:type="dxa" w:w="1928"/>
+          </w:tcPr>
+          <w:p>
+            <w:r>
+              <w:t>3c</w:t>
+            </w:r>
+          </w:p>
+        </w:tc>
+        <w:tc>
+          <w:tcPr>
+            <w:tcW w:type="dxa" w:w="1928"/>
+          </w:tcPr>
+          <w:p>
+            <w:r>
+              <w:t>Added basic pricing display with side-view station details.</w:t>
+            </w:r>
+          </w:p>
+        </w:tc>
+        <w:tc>
+          <w:tcPr>
+            <w:tcW w:type="dxa" w:w="1928"/>
+          </w:tcPr>
+          <w:p>
+            <w:r>
+              <w:t>Medium</w:t>
+            </w:r>
+          </w:p>
+        </w:tc>
+        <w:tc>
+          <w:tcPr>
+            <w:tcW w:type="dxa" w:w="1928"/>
+          </w:tcPr>
+          <w:p>
+            <w:r>
+              <w:t>Complete</w:t>
+            </w:r>
+          </w:p>
+        </w:tc>
+        <w:tc>
+          <w:tcPr>
+            <w:tcW w:type="dxa" w:w="1928"/>
+          </w:tcPr>
+          <w:p>
+            <w:r>
+              <w:t>Thomas R</w:t>
+            </w:r>
+          </w:p>
+        </w:tc>
+      </w:tr>
+      <w:tr>
+        <w:tc>
+          <w:tcPr>
+            <w:tcW w:type="dxa" w:w="1928"/>
+          </w:tcPr>
+          <w:p>
+            <w:r>
+              <w:t>3d</w:t>
+            </w:r>
+          </w:p>
+        </w:tc>
+        <w:tc>
+          <w:tcPr>
+            <w:tcW w:type="dxa" w:w="1928"/>
+          </w:tcPr>
+          <w:p>
+            <w:r>
+              <w:t>Implemented marker click InfoWindow with sorted fuel prices.</w:t>
+            </w:r>
+          </w:p>
+        </w:tc>
+        <w:tc>
+          <w:tcPr>
+            <w:tcW w:type="dxa" w:w="1928"/>
+          </w:tcPr>
+          <w:p>
+            <w:r>
+              <w:t>High</w:t>
+            </w:r>
+          </w:p>
+        </w:tc>
+        <w:tc>
+          <w:tcPr>
+            <w:tcW w:type="dxa" w:w="1928"/>
+          </w:tcPr>
+          <w:p>
+            <w:r>
+              <w:t>Complete</w:t>
+            </w:r>
+          </w:p>
+        </w:tc>
+        <w:tc>
+          <w:tcPr>
+            <w:tcW w:type="dxa" w:w="1928"/>
+          </w:tcPr>
+          <w:p>
+            <w:r>
+              <w:t>Eric P</w:t>
+            </w:r>
+          </w:p>
+        </w:tc>
+      </w:tr>
+      <w:tr>
+        <w:tc>
+          <w:tcPr>
+            <w:tcW w:type="dxa" w:w="1928"/>
+          </w:tcPr>
+          <w:p>
+            <w:r>
+              <w:t>3e</w:t>
+            </w:r>
+          </w:p>
+        </w:tc>
+        <w:tc>
+          <w:tcPr>
+            <w:tcW w:type="dxa" w:w="1928"/>
+          </w:tcPr>
+          <w:p>
+            <w:r>
+              <w:t>Added fuel type and fuel grade filtering for station price sorting.</w:t>
+            </w:r>
+          </w:p>
+        </w:tc>
+        <w:tc>
+          <w:tcPr>
+            <w:tcW w:type="dxa" w:w="1928"/>
+          </w:tcPr>
+          <w:p>
+            <w:r>
+              <w:t>High</w:t>
+            </w:r>
+          </w:p>
+        </w:tc>
+        <w:tc>
+          <w:tcPr>
+            <w:tcW w:type="dxa" w:w="1928"/>
+          </w:tcPr>
+          <w:p>
+            <w:r>
+              <w:t>Complete</w:t>
+            </w:r>
+          </w:p>
+        </w:tc>
+        <w:tc>
+          <w:tcPr>
+            <w:tcW w:type="dxa" w:w="1928"/>
+          </w:tcPr>
+          <w:p>
+            <w:r>
+              <w:t>Eric P</w:t>
+            </w:r>
+          </w:p>
+        </w:tc>
+      </w:tr>
+      <w:tr>
+        <w:tc>
+          <w:tcPr>
+            <w:tcW w:type="dxa" w:w="1928"/>
+          </w:tcPr>
+          <w:p>
+            <w:r>
+              <w:t>3f</w:t>
+            </w:r>
+          </w:p>
+        </w:tc>
+        <w:tc>
+          <w:tcPr>
+            <w:tcW w:type="dxa" w:w="1928"/>
+          </w:tcPr>
+          <w:p>
+            <w:r>
+              <w:t>Fixed fuel price rendering issues and improved frontend visual theme.</w:t>
+            </w:r>
+          </w:p>
+        </w:tc>
+        <w:tc>
+          <w:tcPr>
+            <w:tcW w:type="dxa" w:w="1928"/>
+          </w:tcPr>
+          <w:p>
+            <w:r>
+              <w:t>Medium</w:t>
+            </w:r>
+          </w:p>
+        </w:tc>
+        <w:tc>
+          <w:tcPr>
+            <w:tcW w:type="dxa" w:w="1928"/>
+          </w:tcPr>
+          <w:p>
+            <w:r>
+              <w:t>Complete</w:t>
+            </w:r>
+          </w:p>
+        </w:tc>
+        <w:tc>
+          <w:tcPr>
+            <w:tcW w:type="dxa" w:w="1928"/>
+          </w:tcPr>
+          <w:p>
+            <w:r>
+              <w:t>Thomas R</w:t>
+            </w:r>
+          </w:p>
+        </w:tc>
+      </w:tr>
+      <w:tr>
+        <w:tc>
+          <w:tcPr>
+            <w:tcW w:type="dxa" w:w="1928"/>
+          </w:tcPr>
+          <w:p>
+            <w:r>
+              <w:t>3g</w:t>
+            </w:r>
+          </w:p>
+        </w:tc>
+        <w:tc>
+          <w:tcPr>
+            <w:tcW w:type="dxa" w:w="1928"/>
+          </w:tcPr>
+          <w:p>
+            <w:r>
+              <w:t>Expanded backend automated tests for app and price services; fixed frontend tests.</w:t>
+            </w:r>
+          </w:p>
+        </w:tc>
+        <w:tc>
+          <w:tcPr>
+            <w:tcW w:type="dxa" w:w="1928"/>
+          </w:tcPr>
+          <w:p>
+            <w:r>
+              <w:t>High</w:t>
+            </w:r>
+          </w:p>
+        </w:tc>
+        <w:tc>
+          <w:tcPr>
+            <w:tcW w:type="dxa" w:w="1928"/>
+          </w:tcPr>
+          <w:p>
+            <w:r>
+              <w:t>Complete</w:t>
+            </w:r>
+          </w:p>
+        </w:tc>
+        <w:tc>
+          <w:tcPr>
+            <w:tcW w:type="dxa" w:w="1928"/>
+          </w:tcPr>
+          <w:p>
+            <w:r>
+              <w:t>Kyler C</w:t>
+            </w:r>
+          </w:p>
+        </w:tc>
+      </w:tr>
+      <w:tr>
+        <w:tc>
+          <w:tcPr>
+            <w:tcW w:type="dxa" w:w="1928"/>
+          </w:tcPr>
+          <w:p>
+            <w:r>
+              <w:t>3h</w:t>
+            </w:r>
+          </w:p>
+        </w:tc>
+        <w:tc>
+          <w:tcPr>
+            <w:tcW w:type="dxa" w:w="1928"/>
+          </w:tcPr>
+          <w:p>
+            <w:r>
+              <w:t>Updated Docker and port configuration plus API/CORS environment settings.</w:t>
+            </w:r>
+          </w:p>
+        </w:tc>
+        <w:tc>
+          <w:tcPr>
+            <w:tcW w:type="dxa" w:w="1928"/>
+          </w:tcPr>
+          <w:p>
+            <w:r>
+              <w:t>Medium</w:t>
+            </w:r>
+          </w:p>
+        </w:tc>
+        <w:tc>
+          <w:tcPr>
+            <w:tcW w:type="dxa" w:w="1928"/>
+          </w:tcPr>
+          <w:p>
+            <w:r>
+              <w:t>Complete</w:t>
+            </w:r>
+          </w:p>
+        </w:tc>
+        <w:tc>
+          <w:tcPr>
+            <w:tcW w:type="dxa" w:w="1928"/>
+          </w:tcPr>
+          <w:p>
+            <w:r>
+              <w:t>Nate C</w:t>
+            </w:r>
+          </w:p>
+        </w:tc>
+      </w:tr>
+      <w:tr>
+        <w:tc>
+          <w:tcPr>
+            <w:tcW w:type="dxa" w:w="1928"/>
+          </w:tcPr>
+          <w:p>
+            <w:r>
+              <w:t>3i</w:t>
+            </w:r>
+          </w:p>
+        </w:tc>
+        <w:tc>
+          <w:tcPr>
+            <w:tcW w:type="dxa" w:w="1928"/>
+          </w:tcPr>
+          <w:p>
+            <w:r>
+              <w:t>Completed Sprint 3 documentation updates (baseline, class diagram, and bug report template).</w:t>
+            </w:r>
+          </w:p>
+        </w:tc>
+        <w:tc>
+          <w:tcPr>
+            <w:tcW w:type="dxa" w:w="1928"/>
+          </w:tcPr>
+          <w:p>
+            <w:r>
+              <w:t>Medium</w:t>
+            </w:r>
+          </w:p>
+        </w:tc>
+        <w:tc>
+          <w:tcPr>
+            <w:tcW w:type="dxa" w:w="1928"/>
+          </w:tcPr>
+          <w:p>
+            <w:r>
+              <w:t>Complete</w:t>
+            </w:r>
+          </w:p>
+        </w:tc>
+        <w:tc>
+          <w:tcPr>
+            <w:tcW w:type="dxa" w:w="1928"/>
+          </w:tcPr>
+          <w:p>
+            <w:r>
+              <w:t>Eric P</w:t>
+            </w:r>
+          </w:p>
+        </w:tc>
+      </w:tr>
+    </w:tbl>
     <w:p/>
     <w:sectPr>
       <w:type w:val="nextPage"/>

</xml_diff>

<commit_message>
Update diagram and Baseline and backlog complete
</commit_message>
<xml_diff>
--- a/documentation/Backlog.docx
+++ b/documentation/Backlog.docx
@@ -5867,6 +5867,748 @@
       </w:tr>
     </w:tbl>
     <w:p/>
+    <w:p>
+      <w:r>
+        <w:t>Backlog Sprint 4:</w:t>
+      </w:r>
+    </w:p>
+    <w:tbl>
+      <w:tblPr>
+        <w:tblStyle w:val="TableGrid"/>
+        <w:tblW w:type="auto" w:w="0"/>
+      </w:tblPr>
+      <w:tr>
+        <w:tc>
+          <w:tcPr>
+            <w:tcW w:type="dxa" w:w="547"/>
+          </w:tcPr>
+          <w:p>
+            <w:r>
+              <w:t>ID</w:t>
+            </w:r>
+          </w:p>
+        </w:tc>
+        <w:tc>
+          <w:tcPr>
+            <w:tcW w:type="dxa" w:w="4500"/>
+          </w:tcPr>
+          <w:p>
+            <w:r>
+              <w:t>Task</w:t>
+            </w:r>
+          </w:p>
+        </w:tc>
+        <w:tc>
+          <w:tcPr>
+            <w:tcW w:type="dxa" w:w="900"/>
+          </w:tcPr>
+          <w:p>
+            <w:r>
+              <w:t>Priority</w:t>
+            </w:r>
+          </w:p>
+        </w:tc>
+        <w:tc>
+          <w:tcPr>
+            <w:tcW w:type="dxa" w:w="1000"/>
+          </w:tcPr>
+          <w:p>
+            <w:r>
+              <w:t>Status</w:t>
+            </w:r>
+          </w:p>
+        </w:tc>
+        <w:tc>
+          <w:tcPr>
+            <w:tcW w:type="dxa" w:w="1093"/>
+          </w:tcPr>
+          <w:p>
+            <w:r>
+              <w:t>Assigned To</w:t>
+            </w:r>
+          </w:p>
+        </w:tc>
+      </w:tr>
+      <w:tr>
+        <w:tc>
+          <w:tcPr>
+            <w:tcW w:type="dxa" w:w="547"/>
+          </w:tcPr>
+          <w:p>
+            <w:r>
+              <w:t>4a</w:t>
+            </w:r>
+          </w:p>
+        </w:tc>
+        <w:tc>
+          <w:tcPr>
+            <w:tcW w:type="dxa" w:w="4500"/>
+          </w:tcPr>
+          <w:p>
+            <w:r>
+              <w:t>Added Google Maps directions link (Get Directions button) to station detail view</w:t>
+            </w:r>
+          </w:p>
+        </w:tc>
+        <w:tc>
+          <w:tcPr>
+            <w:tcW w:type="dxa" w:w="900"/>
+          </w:tcPr>
+          <w:p>
+            <w:r>
+              <w:t>High</w:t>
+            </w:r>
+          </w:p>
+        </w:tc>
+        <w:tc>
+          <w:tcPr>
+            <w:tcW w:type="dxa" w:w="1000"/>
+          </w:tcPr>
+          <w:p>
+            <w:r>
+              <w:t>Complete</w:t>
+            </w:r>
+          </w:p>
+        </w:tc>
+        <w:tc>
+          <w:tcPr>
+            <w:tcW w:type="dxa" w:w="1093"/>
+          </w:tcPr>
+          <w:p>
+            <w:r>
+              <w:t>Kyler C</w:t>
+            </w:r>
+          </w:p>
+        </w:tc>
+      </w:tr>
+      <w:tr>
+        <w:tc>
+          <w:tcPr>
+            <w:tcW w:type="dxa" w:w="547"/>
+          </w:tcPr>
+          <w:p>
+            <w:r>
+              <w:t>4b</w:t>
+            </w:r>
+          </w:p>
+        </w:tc>
+        <w:tc>
+          <w:tcPr>
+            <w:tcW w:type="dxa" w:w="4500"/>
+          </w:tcPr>
+          <w:p>
+            <w:r>
+              <w:t>Removed tracked dev.db file from repository</w:t>
+            </w:r>
+          </w:p>
+        </w:tc>
+        <w:tc>
+          <w:tcPr>
+            <w:tcW w:type="dxa" w:w="900"/>
+          </w:tcPr>
+          <w:p>
+            <w:r>
+              <w:t>Low</w:t>
+            </w:r>
+          </w:p>
+        </w:tc>
+        <w:tc>
+          <w:tcPr>
+            <w:tcW w:type="dxa" w:w="1000"/>
+          </w:tcPr>
+          <w:p>
+            <w:r>
+              <w:t>Complete</w:t>
+            </w:r>
+          </w:p>
+        </w:tc>
+        <w:tc>
+          <w:tcPr>
+            <w:tcW w:type="dxa" w:w="1093"/>
+          </w:tcPr>
+          <w:p>
+            <w:r>
+              <w:t>Kyler C</w:t>
+            </w:r>
+          </w:p>
+        </w:tc>
+      </w:tr>
+      <w:tr>
+        <w:tc>
+          <w:tcPr>
+            <w:tcW w:type="dxa" w:w="547"/>
+          </w:tcPr>
+          <w:p>
+            <w:r>
+              <w:t>4c</w:t>
+            </w:r>
+          </w:p>
+        </w:tc>
+        <w:tc>
+          <w:tcPr>
+            <w:tcW w:type="dxa" w:w="4500"/>
+          </w:tcPr>
+          <w:p>
+            <w:r>
+              <w:t>Updated UML class diagram (current implementation vs. SRS comparison)</w:t>
+            </w:r>
+          </w:p>
+        </w:tc>
+        <w:tc>
+          <w:tcPr>
+            <w:tcW w:type="dxa" w:w="900"/>
+          </w:tcPr>
+          <w:p>
+            <w:r>
+              <w:t>Medium</w:t>
+            </w:r>
+          </w:p>
+        </w:tc>
+        <w:tc>
+          <w:tcPr>
+            <w:tcW w:type="dxa" w:w="1000"/>
+          </w:tcPr>
+          <w:p>
+            <w:r>
+              <w:t>Complete</w:t>
+            </w:r>
+          </w:p>
+        </w:tc>
+        <w:tc>
+          <w:tcPr>
+            <w:tcW w:type="dxa" w:w="1093"/>
+          </w:tcPr>
+          <w:p>
+            <w:r>
+              <w:t>Eric P</w:t>
+            </w:r>
+          </w:p>
+        </w:tc>
+      </w:tr>
+      <w:tr>
+        <w:tc>
+          <w:tcPr>
+            <w:tcW w:type="dxa" w:w="547"/>
+          </w:tcPr>
+          <w:p>
+            <w:r>
+              <w:t>4d</w:t>
+            </w:r>
+          </w:p>
+        </w:tc>
+        <w:tc>
+          <w:tcPr>
+            <w:tcW w:type="dxa" w:w="4500"/>
+          </w:tcPr>
+          <w:p>
+            <w:r>
+              <w:t>Created Baseline Sprint 4 documentation</w:t>
+            </w:r>
+          </w:p>
+        </w:tc>
+        <w:tc>
+          <w:tcPr>
+            <w:tcW w:type="dxa" w:w="900"/>
+          </w:tcPr>
+          <w:p>
+            <w:r>
+              <w:t>Medium</w:t>
+            </w:r>
+          </w:p>
+        </w:tc>
+        <w:tc>
+          <w:tcPr>
+            <w:tcW w:type="dxa" w:w="1000"/>
+          </w:tcPr>
+          <w:p>
+            <w:r>
+              <w:t>Complete</w:t>
+            </w:r>
+          </w:p>
+        </w:tc>
+        <w:tc>
+          <w:tcPr>
+            <w:tcW w:type="dxa" w:w="1093"/>
+          </w:tcPr>
+          <w:p>
+            <w:r>
+              <w:t>Eric P</w:t>
+            </w:r>
+          </w:p>
+        </w:tc>
+      </w:tr>
+      <w:tr>
+        <w:tc>
+          <w:tcPr>
+            <w:tcW w:type="dxa" w:w="547"/>
+          </w:tcPr>
+          <w:p>
+            <w:r>
+              <w:t>4e</w:t>
+            </w:r>
+          </w:p>
+        </w:tc>
+        <w:tc>
+          <w:tcPr>
+            <w:tcW w:type="dxa" w:w="4500"/>
+          </w:tcPr>
+          <w:p>
+            <w:r>
+              <w:t>Updated Bug Report template and Comprehensive Test Plan documentation</w:t>
+            </w:r>
+          </w:p>
+        </w:tc>
+        <w:tc>
+          <w:tcPr>
+            <w:tcW w:type="dxa" w:w="900"/>
+          </w:tcPr>
+          <w:p>
+            <w:r>
+              <w:t>Medium</w:t>
+            </w:r>
+          </w:p>
+        </w:tc>
+        <w:tc>
+          <w:tcPr>
+            <w:tcW w:type="dxa" w:w="1000"/>
+          </w:tcPr>
+          <w:p>
+            <w:r>
+              <w:t>Complete</w:t>
+            </w:r>
+          </w:p>
+        </w:tc>
+        <w:tc>
+          <w:tcPr>
+            <w:tcW w:type="dxa" w:w="1093"/>
+          </w:tcPr>
+          <w:p>
+            <w:r>
+              <w:t>Nathan C, Thomas R</w:t>
+            </w:r>
+          </w:p>
+        </w:tc>
+      </w:tr>
+      <w:tr>
+        <w:tc>
+          <w:tcPr>
+            <w:tcW w:type="dxa" w:w="547"/>
+          </w:tcPr>
+          <w:p>
+            <w:r>
+              <w:t>4f</w:t>
+            </w:r>
+          </w:p>
+        </w:tc>
+        <w:tc>
+          <w:tcPr>
+            <w:tcW w:type="dxa" w:w="4500"/>
+          </w:tcPr>
+          <w:p>
+            <w:r>
+              <w:t>Updated automated testing documentation (AUTOMATED_TESTING.md)</w:t>
+            </w:r>
+          </w:p>
+        </w:tc>
+        <w:tc>
+          <w:tcPr>
+            <w:tcW w:type="dxa" w:w="900"/>
+          </w:tcPr>
+          <w:p>
+            <w:r>
+              <w:t>Medium</w:t>
+            </w:r>
+          </w:p>
+        </w:tc>
+        <w:tc>
+          <w:tcPr>
+            <w:tcW w:type="dxa" w:w="1000"/>
+          </w:tcPr>
+          <w:p>
+            <w:r>
+              <w:t>Complete</w:t>
+            </w:r>
+          </w:p>
+        </w:tc>
+        <w:tc>
+          <w:tcPr>
+            <w:tcW w:type="dxa" w:w="1093"/>
+          </w:tcPr>
+          <w:p>
+            <w:r>
+              <w:t>Kyler C</w:t>
+            </w:r>
+          </w:p>
+        </w:tc>
+      </w:tr>
+      <w:tr>
+        <w:tc>
+          <w:tcPr>
+            <w:tcW w:type="dxa" w:w="547"/>
+          </w:tcPr>
+          <w:p>
+            <w:r>
+              <w:t>4g</w:t>
+            </w:r>
+          </w:p>
+        </w:tc>
+        <w:tc>
+          <w:tcPr>
+            <w:tcW w:type="dxa" w:w="4500"/>
+          </w:tcPr>
+          <w:p>
+            <w:r>
+              <w:t>Added meeting log for 4-6-26 through 4-12-26</w:t>
+            </w:r>
+          </w:p>
+        </w:tc>
+        <w:tc>
+          <w:tcPr>
+            <w:tcW w:type="dxa" w:w="900"/>
+          </w:tcPr>
+          <w:p>
+            <w:r>
+              <w:t>Low</w:t>
+            </w:r>
+          </w:p>
+        </w:tc>
+        <w:tc>
+          <w:tcPr>
+            <w:tcW w:type="dxa" w:w="1000"/>
+          </w:tcPr>
+          <w:p>
+            <w:r>
+              <w:t>Complete</w:t>
+            </w:r>
+          </w:p>
+        </w:tc>
+        <w:tc>
+          <w:tcPr>
+            <w:tcW w:type="dxa" w:w="1093"/>
+          </w:tcPr>
+          <w:p>
+            <w:r>
+              <w:t>Eric P</w:t>
+            </w:r>
+          </w:p>
+        </w:tc>
+      </w:tr>
+      <w:tr>
+        <w:tc>
+          <w:tcPr>
+            <w:tcW w:type="dxa" w:w="547"/>
+          </w:tcPr>
+          <w:p>
+            <w:r>
+              <w:t>4h</w:t>
+            </w:r>
+          </w:p>
+        </w:tc>
+        <w:tc>
+          <w:tcPr>
+            <w:tcW w:type="dxa" w:w="4500"/>
+          </w:tcPr>
+          <w:p>
+            <w:r>
+              <w:t>Implement manual location entry form (FR-CD-2)</w:t>
+            </w:r>
+          </w:p>
+        </w:tc>
+        <w:tc>
+          <w:tcPr>
+            <w:tcW w:type="dxa" w:w="900"/>
+          </w:tcPr>
+          <w:p>
+            <w:r>
+              <w:t>High</w:t>
+            </w:r>
+          </w:p>
+        </w:tc>
+        <w:tc>
+          <w:tcPr>
+            <w:tcW w:type="dxa" w:w="1000"/>
+          </w:tcPr>
+          <w:p>
+            <w:r>
+              <w:t>Not Started</w:t>
+            </w:r>
+          </w:p>
+        </w:tc>
+        <w:tc>
+          <w:tcPr>
+            <w:tcW w:type="dxa" w:w="1093"/>
+          </w:tcPr>
+          <w:p>
+            <w:r>
+              <w:t>TBD</w:t>
+            </w:r>
+          </w:p>
+        </w:tc>
+      </w:tr>
+      <w:tr>
+        <w:tc>
+          <w:tcPr>
+            <w:tcW w:type="dxa" w:w="547"/>
+          </w:tcPr>
+          <w:p>
+            <w:r>
+              <w:t>4i</w:t>
+            </w:r>
+          </w:p>
+        </w:tc>
+        <w:tc>
+          <w:tcPr>
+            <w:tcW w:type="dxa" w:w="4500"/>
+          </w:tcPr>
+          <w:p>
+            <w:r>
+              <w:t>Implement discount program CRUD and automatic price application (FR-SF-7 to FR-SF-11)</w:t>
+            </w:r>
+          </w:p>
+        </w:tc>
+        <w:tc>
+          <w:tcPr>
+            <w:tcW w:type="dxa" w:w="900"/>
+          </w:tcPr>
+          <w:p>
+            <w:r>
+              <w:t>High</w:t>
+            </w:r>
+          </w:p>
+        </w:tc>
+        <w:tc>
+          <w:tcPr>
+            <w:tcW w:type="dxa" w:w="1000"/>
+          </w:tcPr>
+          <w:p>
+            <w:r>
+              <w:t>Not Started</w:t>
+            </w:r>
+          </w:p>
+        </w:tc>
+        <w:tc>
+          <w:tcPr>
+            <w:tcW w:type="dxa" w:w="1093"/>
+          </w:tcPr>
+          <w:p>
+            <w:r>
+              <w:t>TBD</w:t>
+            </w:r>
+          </w:p>
+        </w:tc>
+      </w:tr>
+      <w:tr>
+        <w:tc>
+          <w:tcPr>
+            <w:tcW w:type="dxa" w:w="547"/>
+          </w:tcPr>
+          <w:p>
+            <w:r>
+              <w:t>4j</w:t>
+            </w:r>
+          </w:p>
+        </w:tc>
+        <w:tc>
+          <w:tcPr>
+            <w:tcW w:type="dxa" w:w="4500"/>
+          </w:tcPr>
+          <w:p>
+            <w:r>
+              <w:t>Add frontend offline cache and sync strategy (FR-DH-2, FR-DH-3, FR-DH-4)</w:t>
+            </w:r>
+          </w:p>
+        </w:tc>
+        <w:tc>
+          <w:tcPr>
+            <w:tcW w:type="dxa" w:w="900"/>
+          </w:tcPr>
+          <w:p>
+            <w:r>
+              <w:t>Medium</w:t>
+            </w:r>
+          </w:p>
+        </w:tc>
+        <w:tc>
+          <w:tcPr>
+            <w:tcW w:type="dxa" w:w="1000"/>
+          </w:tcPr>
+          <w:p>
+            <w:r>
+              <w:t>Not Started</w:t>
+            </w:r>
+          </w:p>
+        </w:tc>
+        <w:tc>
+          <w:tcPr>
+            <w:tcW w:type="dxa" w:w="1093"/>
+          </w:tcPr>
+          <w:p>
+            <w:r>
+              <w:t>TBD</w:t>
+            </w:r>
+          </w:p>
+        </w:tc>
+      </w:tr>
+      <w:tr>
+        <w:tc>
+          <w:tcPr>
+            <w:tcW w:type="dxa" w:w="547"/>
+          </w:tcPr>
+          <w:p>
+            <w:r>
+              <w:t>4k</w:t>
+            </w:r>
+          </w:p>
+        </w:tc>
+        <w:tc>
+          <w:tcPr>
+            <w:tcW w:type="dxa" w:w="4500"/>
+          </w:tcPr>
+          <w:p>
+            <w:r>
+              <w:t>Implement price threshold filtering (FR-SF-4)</w:t>
+            </w:r>
+          </w:p>
+        </w:tc>
+        <w:tc>
+          <w:tcPr>
+            <w:tcW w:type="dxa" w:w="900"/>
+          </w:tcPr>
+          <w:p>
+            <w:r>
+              <w:t>Medium</w:t>
+            </w:r>
+          </w:p>
+        </w:tc>
+        <w:tc>
+          <w:tcPr>
+            <w:tcW w:type="dxa" w:w="1000"/>
+          </w:tcPr>
+          <w:p>
+            <w:r>
+              <w:t>Not Started</w:t>
+            </w:r>
+          </w:p>
+        </w:tc>
+        <w:tc>
+          <w:tcPr>
+            <w:tcW w:type="dxa" w:w="1093"/>
+          </w:tcPr>
+          <w:p>
+            <w:r>
+              <w:t>TBD</w:t>
+            </w:r>
+          </w:p>
+        </w:tc>
+      </w:tr>
+      <w:tr>
+        <w:tc>
+          <w:tcPr>
+            <w:tcW w:type="dxa" w:w="547"/>
+          </w:tcPr>
+          <w:p>
+            <w:r>
+              <w:t>4l</w:t>
+            </w:r>
+          </w:p>
+        </w:tc>
+        <w:tc>
+          <w:tcPr>
+            <w:tcW w:type="dxa" w:w="4500"/>
+          </w:tcPr>
+          <w:p>
+            <w:r>
+              <w:t>Add API rate limiting middleware (NFR-SE-3)</w:t>
+            </w:r>
+          </w:p>
+        </w:tc>
+        <w:tc>
+          <w:tcPr>
+            <w:tcW w:type="dxa" w:w="900"/>
+          </w:tcPr>
+          <w:p>
+            <w:r>
+              <w:t>Medium</w:t>
+            </w:r>
+          </w:p>
+        </w:tc>
+        <w:tc>
+          <w:tcPr>
+            <w:tcW w:type="dxa" w:w="1000"/>
+          </w:tcPr>
+          <w:p>
+            <w:r>
+              <w:t>Not Started</w:t>
+            </w:r>
+          </w:p>
+        </w:tc>
+        <w:tc>
+          <w:tcPr>
+            <w:tcW w:type="dxa" w:w="1093"/>
+          </w:tcPr>
+          <w:p>
+            <w:r>
+              <w:t>TBD</w:t>
+            </w:r>
+          </w:p>
+        </w:tc>
+      </w:tr>
+    </w:tbl>
+    <w:p>
+      <w:r>
+        <w:t>Customer Feedback for Sprint 3/4</w:t>
+      </w:r>
+    </w:p>
+    <w:p>
+      <w:r>
+        <w:t>Observations</w:t>
+      </w:r>
+    </w:p>
+    <w:p>
+      <w:r>
+        <w:t>Google Maps directions button successfully links to turn-by-turn navigation</w:t>
+      </w:r>
+    </w:p>
+    <w:p>
+      <w:r>
+        <w:t>Station list and filter controls are functional and intuitive</w:t>
+      </w:r>
+    </w:p>
+    <w:p>
+      <w:r>
+        <w:t>Pricing data displays correctly per fuel grade in station detail panel</w:t>
+      </w:r>
+    </w:p>
+    <w:p>
+      <w:r>
+        <w:t>No way to manually enter a location when GPS is unavailable</w:t>
+      </w:r>
+    </w:p>
+    <w:p>
+      <w:r>
+        <w:t>No discount/loyalty program input available</w:t>
+      </w:r>
+    </w:p>
+    <w:p>
+      <w:r>
+        <w:t>Feedback refactoring for Sprint 4</w:t>
+      </w:r>
+    </w:p>
+    <w:p>
+      <w:r>
+        <w:t>Add manual location input for users without GPS or who want a different starting point</w:t>
+      </w:r>
+    </w:p>
+    <w:p>
+      <w:r>
+        <w:t>Implement discount program feature so users can factor in loyalty discounts on displayed prices</w:t>
+      </w:r>
+    </w:p>
+    <w:p>
+      <w:r>
+        <w:t>Provide offline/cached data fallback visible to user when network is unavailable</w:t>
+      </w:r>
+    </w:p>
     <w:sectPr>
       <w:type w:val="nextPage"/>
       <w:pgSz w:w="11906" w:h="16838"/>

</xml_diff>